<commit_message>
Update 4/22/2023 6:14AM EST
Updates as of 6:14AM EST on 4/22/2023.
</commit_message>
<xml_diff>
--- a/20230422 - MCE123 Technology Development - Illicit Government Software Runtime Prevention Security Systems - v1.0.0.3.docx
+++ b/20230422 - MCE123 Technology Development - Illicit Government Software Runtime Prevention Security Systems - v1.0.0.3.docx
@@ -223,7 +223,7 @@
           <w:sz w:val="28"/>
           <w:szCs w:val="28"/>
         </w:rPr>
-        <w:t>4/22/2023 1:59:52 AM</w:t>
+        <w:t>4/22/2023 2:10:12 AM</w:t>
       </w:r>
     </w:p>
     <w:p>
@@ -531,16 +531,77 @@
         <w:t>RUN</w:t>
       </w:r>
       <w:r>
-        <w:t xml:space="preserve">, </w:t>
-      </w:r>
-      <w:r>
-        <w:t xml:space="preserve">                             </w:t>
-      </w:r>
-      <w:r>
-        <w:t xml:space="preserve">                    </w:t>
-      </w:r>
-      <w:r>
-        <w:t xml:space="preserve"> </w:t>
+        <w:t xml:space="preserve"> </w:t>
+      </w:r>
+      <w:r>
+        <w:rPr>
+          <w:b/>
+          <w:bCs/>
+          <w:color w:val="00B0F0"/>
+        </w:rPr>
+        <w:t>AND</w:t>
+      </w:r>
+      <w:r>
+        <w:rPr>
+          <w:b/>
+          <w:bCs/>
+        </w:rPr>
+        <w:t xml:space="preserve"> </w:t>
+      </w:r>
+      <w:r>
+        <w:rPr>
+          <w:b/>
+          <w:bCs/>
+          <w:color w:val="0070C0"/>
+        </w:rPr>
+        <w:t>IS</w:t>
+      </w:r>
+      <w:r>
+        <w:rPr>
+          <w:b/>
+          <w:bCs/>
+        </w:rPr>
+        <w:t xml:space="preserve"> </w:t>
+      </w:r>
+      <w:r>
+        <w:rPr>
+          <w:b/>
+          <w:bCs/>
+          <w:color w:val="7030A0"/>
+        </w:rPr>
+        <w:t>DELETED</w:t>
+      </w:r>
+      <w:r>
+        <w:rPr>
+          <w:b/>
+          <w:bCs/>
+        </w:rPr>
+        <w:t>,</w:t>
+      </w:r>
+      <w:r>
+        <w:rPr>
+          <w:b/>
+          <w:bCs/>
+        </w:rPr>
+        <w:t xml:space="preserve"> </w:t>
+      </w:r>
+      <w:r>
+        <w:rPr>
+          <w:b/>
+          <w:bCs/>
+          <w:color w:val="00B050"/>
+        </w:rPr>
+        <w:t>PERMANENTLY</w:t>
+      </w:r>
+      <w:r>
+        <w:rPr>
+          <w:b/>
+          <w:bCs/>
+        </w:rPr>
+        <w:t>,</w:t>
+      </w:r>
+      <w:r>
+        <w:t xml:space="preserve">                                                   </w:t>
       </w:r>
       <w:r>
         <w:rPr>
@@ -1770,82 +1831,6 @@
           <w:color w:val="808080" w:themeColor="background1" w:themeShade="80"/>
         </w:rPr>
         <w:t>ALLEGEDLY USED TO CAUSE COMPLACENCY UTILIZING MIND CONTROL ON AN UNWILLING VICTIM.</w:t>
-      </w:r>
-    </w:p>
-    <w:p>
-      <w:pPr>
-        <w:ind w:left="720"/>
-        <w:jc w:val="both"/>
-        <w:rPr>
-          <w:b/>
-          <w:bCs/>
-        </w:rPr>
-      </w:pPr>
-      <w:r>
-        <w:rPr>
-          <w:u w:val="single"/>
-        </w:rPr>
-        <w:t>PREVENTION SECURITY SYSTEM</w:t>
-      </w:r>
-      <w:r>
-        <w:t>:</w:t>
-      </w:r>
-      <w:r>
-        <w:t xml:space="preserve"> </w:t>
-      </w:r>
-      <w:r>
-        <w:rPr>
-          <w:b/>
-          <w:bCs/>
-          <w:color w:val="FF0000"/>
-        </w:rPr>
-        <w:t xml:space="preserve">ANY </w:t>
-      </w:r>
-      <w:r>
-        <w:rPr>
-          <w:b/>
-          <w:bCs/>
-          <w:color w:val="FF0000"/>
-        </w:rPr>
-        <w:t>EX-JUDICIAL EXECUTION SYSTEMS</w:t>
-      </w:r>
-      <w:r>
-        <w:rPr>
-          <w:b/>
-          <w:bCs/>
-        </w:rPr>
-        <w:t>;</w:t>
-      </w:r>
-      <w:r>
-        <w:rPr>
-          <w:b/>
-          <w:bCs/>
-        </w:rPr>
-        <w:t xml:space="preserve"> </w:t>
-      </w:r>
-      <w:r>
-        <w:rPr>
-          <w:color w:val="808080" w:themeColor="background1" w:themeShade="80"/>
-        </w:rPr>
-        <w:t xml:space="preserve">// </w:t>
-      </w:r>
-      <w:r>
-        <w:rPr>
-          <w:color w:val="808080" w:themeColor="background1" w:themeShade="80"/>
-        </w:rPr>
-        <w:t xml:space="preserve">ALLEGEDLY ILLICIT EX-JUDICIAL EXECUTION SOFTWARE DEVELOPED BY </w:t>
-      </w:r>
-      <w:r>
-        <w:rPr>
-          <w:color w:val="808080" w:themeColor="background1" w:themeShade="80"/>
-        </w:rPr>
-        <w:t>CHRISTOPHER J. HAWKINSON</w:t>
-      </w:r>
-      <w:r>
-        <w:rPr>
-          <w:color w:val="808080" w:themeColor="background1" w:themeShade="80"/>
-        </w:rPr>
-        <w:t xml:space="preserve"> OR OTHER FORMER OR CURRENT FEDERAL EMPLOYEES.</w:t>
       </w:r>
     </w:p>
     <w:p>
@@ -2004,7 +1989,6 @@
         <w:rPr>
           <w:u w:val="single"/>
         </w:rPr>
-        <w:lastRenderedPageBreak/>
         <w:t>PREVENTION SECURITY SYSTEM</w:t>
       </w:r>
       <w:r>
@@ -2071,6 +2055,7 @@
         <w:rPr>
           <w:u w:val="single"/>
         </w:rPr>
+        <w:lastRenderedPageBreak/>
         <w:t>PREVENTION SECURITY SYSTEM</w:t>
       </w:r>
       <w:r>

</xml_diff>